<commit_message>
Doprecyzowano konfiguracje backendu i dokumentacje testow
Dodano stabilna serializacje stron Spring Data oraz asercje i dynamiczne ID w kolekcji Bruno. Zaktualizowano dokumentacje backendu, wymagan, testow oraz artefakty DOCX/PDF pod aktualny stan projektu.
</commit_message>
<xml_diff>
--- a/US Projekt - dokumentacja uzupelniona.docx
+++ b/US Projekt - dokumentacja uzupelniona.docx
@@ -7919,7 +7919,13 @@
         <w:jc w:val="left"/>
       </w:pPr>
       <w:r>
-        <w:t>W bieżącym katalogu projektu znajduje się kolekcja testów REST w folderze testcase. Kolekcja jest zapisana w formacie OpenCollection YAML z rozszerzeniem bruno, zawiera plik opencollection.yml, środowisko testcase/environments/hops-ops.yml oraz 23 żądania HTTP. Na moment sprawdzenia folder testcase jest lokalny i nieśledzony w Git, dlatego nie będzie widoczny na GitHubie, dopóki nie zostanie dodany, zapisany w commicie i wypchnięty do zdalnego repozytorium.</w:t>
+        <w:t>W bieżącym katalogu projektu znajduje się śledzona w repozytorium kolekcja testów REST w folderze testcase. Kolekcja jest zapisana w formacie OpenCollection YAML z rozszerzeniem Bruno, zawiera plik opencollection.yml, środowisko testcase/environments/hops-ops.yml oraz 23 żądania HTTP. Requesty mają asercje statusów HTTP, a kroki tworzące dane zapisują zwrócone identyfikatory do zmiennych Bruno: customer_id, sales_offer_id, rental_offer_id, equipment_id oraz transaction_id. Dzięki temu dalsze kroki kolekcji korzystają z aktualnych ID i nie wymagają ręcznego przepisywania identyfikatorów.</w:t>
+      </w:r>
+    </w:p>
+    <w:p>
+      <w:pPr/>
+      <w:r>
+        <w:t>Pełną kolekcję można uruchomić przy działającym backendzie poleceniem: cd testcase &amp;&amp; npx @usebruno/cli@latest run -r . --env hops-ops. Ostatnia lokalna weryfikacja zakończyła się wynikiem 23/23 requesty passed oraz 23/23 asercje passed.</w:t>
       </w:r>
     </w:p>
     <w:tbl>

</xml_diff>